<commit_message>
fix: limpieza de archivos temporales de Word
</commit_message>
<xml_diff>
--- a/docs_generales/ProyectoTransversal_BBDD.docx
+++ b/docs_generales/ProyectoTransversal_BBDD.docx
@@ -3895,7 +3895,7 @@
                                     <w:sz w:val="16"/>
                                     <w:szCs w:val="16"/>
                                   </w:rPr>
-                                  <w:t>16</w:t>
+                                  <w:t>13</w:t>
                                 </w:r>
                                 <w:r>
                                   <w:rPr>
@@ -3966,7 +3966,7 @@
                               <w:sz w:val="16"/>
                               <w:szCs w:val="16"/>
                             </w:rPr>
-                            <w:t>16</w:t>
+                            <w:t>13</w:t>
                           </w:r>
                           <w:r>
                             <w:rPr>
@@ -5651,7 +5651,7 @@
 </file>
 
 <file path=customXml/itemProps1.xml><?xml version="1.0" encoding="utf-8"?>
-<ds:datastoreItem xmlns:ds="http://schemas.openxmlformats.org/officeDocument/2006/customXml" ds:itemID="{92D0B57E-C410-42FF-95C7-7EB82ECCCA9B}">
+<ds:datastoreItem xmlns:ds="http://schemas.openxmlformats.org/officeDocument/2006/customXml" ds:itemID="{3FC7B90C-DFB8-47F6-B025-6F9DA9332CF1}">
   <ds:schemaRefs>
     <ds:schemaRef ds:uri="http://schemas.openxmlformats.org/officeDocument/2006/bibliography"/>
   </ds:schemaRefs>

</xml_diff>